<commit_message>
Update user manual and proposal for schools support and recent features
Broadens both documents from church-only to church-and-school language
(matching the new signup toggle), fixes the manual's missing "Platform
Administration" chapter, and documents admin-triggered SMS/email code
delivery, camera QR scanning, and web push notifications. Also refreshes
the stale vercel.app links to the current shmeera.com domain.

Co-Authored-By: Claude Sonnet 5 <noreply@anthropic.com>
</commit_message>
<xml_diff>
--- a/docs/Shmeera-Proposal.docx
+++ b/docs/Shmeera-Proposal.docx
@@ -45,7 +45,7 @@
           <w:sz w:val="19"/>
           <w:szCs w:val="19"/>
         </w:rPr>
-        <w:t xml:space="preserve">A secure child check-in and check-out system for your children's ministry</w:t>
+        <w:t xml:space="preserve">A secure child check-in and check-out system for children's ministries and schools</w:t>
       </w:r>
     </w:p>
     <w:p>
@@ -75,7 +75,7 @@
           <w:sz w:val="18"/>
           <w:szCs w:val="18"/>
         </w:rPr>
-        <w:t xml:space="preserve">Dominion City</w:t>
+        <w:t xml:space="preserve">[ Organization Name ]</w:t>
       </w:r>
     </w:p>
     <w:p>
@@ -173,7 +173,7 @@
           <w:sz w:val="18"/>
           <w:szCs w:val="18"/>
         </w:rPr>
-        <w:t xml:space="preserve">Every service, children's ministry teams face the same high-stakes handoff: a parent drops off a child, and hours later a different adult may arrive to pick that child up. Paper sign-in sheets, sticker tags, and memory don't scale once a room has more than a handful of children, and a single mistaken release is the kind of incident a ministry cannot afford.</w:t>
+        <w:t xml:space="preserve">Every service or school day, children's ministry and classroom teams face the same high-stakes handoff: a parent drops off a child, and hours later a different adult may arrive to pick that child up. Paper sign-in sheets, sticker tags, and memory don't scale once a room has more than a handful of children, and a single mistaken release is the kind of incident an organization cannot afford.</w:t>
       </w:r>
     </w:p>
     <w:p>
@@ -218,7 +218,7 @@
           <w:sz w:val="18"/>
           <w:szCs w:val="18"/>
         </w:rPr>
-        <w:t xml:space="preserve">Shmeera is a ready-to-deploy check-in and safety platform built specifically for children's church programs. It runs on any phone, tablet, or browser — no special hardware required — and gives your ministry three coordinated views of the same live data:</w:t>
+        <w:t xml:space="preserve">Shmeera is a ready-to-deploy check-in and safety platform built specifically for children's ministry and school programs. It runs on any phone, tablet, or browser — no special hardware required — and gives your organization three coordinated views of the same live data:</w:t>
       </w:r>
     </w:p>
     <w:p>
@@ -312,7 +312,7 @@
           <w:sz w:val="18"/>
           <w:szCs w:val="18"/>
         </w:rPr>
-        <w:t xml:space="preserve">Because Shmeera is built multi-tenant, your ministry gets its own fully isolated space in the same platform — your families, staff, and records are never visible to any other organization using Shmeera, and setup takes minutes, not a custom build.</w:t>
+        <w:t xml:space="preserve">Because Shmeera is built multi-tenant, your organization gets its own fully isolated space in the same platform — your families, staff, and records are never visible to any other organization using Shmeera, and setup takes minutes, not a custom build.</w:t>
       </w:r>
     </w:p>
     <w:p>
@@ -1018,38 +1018,6 @@
     </w:p>
     <w:p>
       <w:pPr>
-        <w:pStyle w:val="Heading1"/>
-        <w:pBdr>
-          <w:bottom w:val="single" w:color="2E7D6B" w:sz="8" w:space="3"/>
-        </w:pBdr>
-        <w:spacing w:after="70" w:before="160"/>
-      </w:pPr>
-      <w:r>
-        <w:rPr>
-          <w:b/>
-          <w:bCs/>
-          <w:color w:val="1F3A5F"/>
-          <w:sz w:val="24"/>
-          <w:szCs w:val="24"/>
-        </w:rPr>
-        <w:t xml:space="preserve">Getting Your Ministry Started</w:t>
-      </w:r>
-    </w:p>
-    <w:p>
-      <w:pPr>
-        <w:spacing w:after="80" w:line="244"/>
-      </w:pPr>
-      <w:r>
-        <w:rPr>
-          <w:color w:val="1A1A1A"/>
-          <w:sz w:val="18"/>
-          <w:szCs w:val="18"/>
-        </w:rPr>
-        <w:t xml:space="preserve">Because Shmeera already exists as a working, multi-tenant platform, onboarding a new ministry does not require a software build — only setup and training:</w:t>
-      </w:r>
-    </w:p>
-    <w:p>
-      <w:pPr>
         <w:pStyle w:val="ListParagraph"/>
         <w:numPr>
           <w:ilvl w:val="0"/>
@@ -1063,7 +1031,39 @@
           <w:sz w:val="18"/>
           <w:szCs w:val="18"/>
         </w:rPr>
-        <w:t xml:space="preserve">1.  An admin account is created for your ministry, and your rooms/classes are configured with age ranges and capacity.</w:t>
+        <w:t xml:space="preserve">Admins can text and email a pending session's check-in or pickup code directly to a guardian who isn't looking at the app — the same server-side check runs either way.</w:t>
+      </w:r>
+    </w:p>
+    <w:p>
+      <w:pPr>
+        <w:pStyle w:val="Heading1"/>
+        <w:pBdr>
+          <w:bottom w:val="single" w:color="2E7D6B" w:sz="8" w:space="3"/>
+        </w:pBdr>
+        <w:spacing w:after="70" w:before="160"/>
+      </w:pPr>
+      <w:r>
+        <w:rPr>
+          <w:b/>
+          <w:bCs/>
+          <w:color w:val="1F3A5F"/>
+          <w:sz w:val="24"/>
+          <w:szCs w:val="24"/>
+        </w:rPr>
+        <w:t xml:space="preserve">Getting Your Organization Started</w:t>
+      </w:r>
+    </w:p>
+    <w:p>
+      <w:pPr>
+        <w:spacing w:after="80" w:line="244"/>
+      </w:pPr>
+      <w:r>
+        <w:rPr>
+          <w:color w:val="1A1A1A"/>
+          <w:sz w:val="18"/>
+          <w:szCs w:val="18"/>
+        </w:rPr>
+        <w:t xml:space="preserve">Because Shmeera already exists as a working, multi-tenant platform, onboarding a new organization does not require a software build — only setup and training:</w:t>
       </w:r>
     </w:p>
     <w:p>
@@ -1081,7 +1081,7 @@
           <w:sz w:val="18"/>
           <w:szCs w:val="18"/>
         </w:rPr>
-        <w:t xml:space="preserve">2.  Staff and volunteer accounts are added and approved by your admin, with background-check status tracked per person.</w:t>
+        <w:t xml:space="preserve">1.  An admin account is created for your organization, and your rooms/classes are configured with age ranges and capacity.</w:t>
       </w:r>
     </w:p>
     <w:p>
@@ -1099,7 +1099,7 @@
           <w:sz w:val="18"/>
           <w:szCs w:val="18"/>
         </w:rPr>
-        <w:t xml:space="preserve">3.  Families sign up, add their children and any authorized pickup people, and complete consent at registration.</w:t>
+        <w:t xml:space="preserve">2.  Staff and volunteer accounts are added and approved by your admin, with background-check status tracked per person.</w:t>
       </w:r>
     </w:p>
     <w:p>
@@ -1117,7 +1117,7 @@
           <w:sz w:val="18"/>
           <w:szCs w:val="18"/>
         </w:rPr>
-        <w:t xml:space="preserve">4.  A short training session walks staff through accepting a drop-off and approving a pickup — the workflow is designed to take under a minute to learn.</w:t>
+        <w:t xml:space="preserve">3.  Families sign up, add their children and any authorized pickup people, and complete consent at registration.</w:t>
       </w:r>
     </w:p>
     <w:p>
@@ -1135,7 +1135,25 @@
           <w:sz w:val="18"/>
           <w:szCs w:val="18"/>
         </w:rPr>
-        <w:t xml:space="preserve">5.  Your ministry runs a live service with Shmeera, with the printed tag/stub fallback available from day one for any family without a smartphone.</w:t>
+        <w:t xml:space="preserve">4.  A short training session walks staff through accepting a drop-off and approving a pickup — the workflow is designed to take under a minute to learn.</w:t>
+      </w:r>
+    </w:p>
+    <w:p>
+      <w:pPr>
+        <w:pStyle w:val="ListParagraph"/>
+        <w:numPr>
+          <w:ilvl w:val="0"/>
+          <w:numId w:val="2"/>
+        </w:numPr>
+        <w:spacing w:after="30" w:line="232"/>
+      </w:pPr>
+      <w:r>
+        <w:rPr>
+          <w:color w:val="1A1A1A"/>
+          <w:sz w:val="18"/>
+          <w:szCs w:val="18"/>
+        </w:rPr>
+        <w:t xml:space="preserve">5.  Your organization runs its first live day with Shmeera, with the printed tag/stub fallback available from day one for any family without a smartphone.</w:t>
       </w:r>
     </w:p>
     <w:p>
@@ -1167,7 +1185,7 @@
           <w:sz w:val="18"/>
           <w:szCs w:val="18"/>
         </w:rPr>
-        <w:t xml:space="preserve">The current platform fully covers check-in, checkout, messaging, and audit. Known, deliberate next steps — not gaps in the core safety model — include SMS escalation as a fallback alongside push notifications, an offline-sync mode for venues with no connectivity at all, and direct integration with a third-party background-check provider in place of today's manually-set status field.</w:t>
+        <w:t xml:space="preserve">The current platform fully covers check-in, checkout, messaging, audit, OS-level push notifications, and admin-triggered SMS/email code delivery. Known, deliberate next steps — not gaps in the core safety model — include SMS escalation specifically for unread urgent messages (today those escalate to the admin dashboard only), a full offline-sync mode for venues with no connectivity at all, and direct integration with a third-party background-check provider in place of today's manually-set status field.</w:t>
       </w:r>
     </w:p>
     <w:p>
@@ -1199,7 +1217,7 @@
           <w:sz w:val="18"/>
           <w:szCs w:val="18"/>
         </w:rPr>
-        <w:t xml:space="preserve">Pricing is scoped to the size of your ministry — number of children served and rooms staffed — and is intended to be simple to budget for. The structure below is a starting point for discussion:</w:t>
+        <w:t xml:space="preserve">Pricing is scoped to the size of your organization — number of children served and rooms staffed — and is intended to be simple to budget for. The structure below is a starting point for discussion:</w:t>
       </w:r>
     </w:p>
     <w:tbl>
@@ -1478,7 +1496,7 @@
           <w:sz w:val="20"/>
           <w:szCs w:val="20"/>
         </w:rPr>
-        <w:t xml:space="preserve">Final pricing will be confirmed together based on your ministry's size and any customization you'd like.</w:t>
+        <w:t xml:space="preserve">Final pricing will be confirmed together based on your organization's size and any customization you'd like.</w:t>
       </w:r>
     </w:p>
     <w:p>
@@ -1510,7 +1528,7 @@
           <w:sz w:val="18"/>
           <w:szCs w:val="18"/>
         </w:rPr>
-        <w:t xml:space="preserve">Children's ministry safety shouldn't depend on a volunteer's memory or a clipboard sign-in sheet. Shmeera gives your team a system where a mismatched pickup simply cannot happen silently, where every action is accountable, and where a parent is never more than a tap away from the room their child is in.</w:t>
+        <w:t xml:space="preserve">Children's safety shouldn't depend on a volunteer's memory or a clipboard sign-in sheet. Shmeera gives your team a system where a mismatched pickup simply cannot happen silently, where every action is accountable, and where a parent is never more than a tap away from the room their child is in.</w:t>
       </w:r>
     </w:p>
     <w:p>

</xml_diff>